<commit_message>
Contrato Starter: refeito a partir do template Premium (plano recorrente/TCV/trimestral/semestral, cláusulas condicionais mmr/adicionais/mídia) com os entregáveis novos do Starter. Removidas as cláusulas de 45 dias fixo, não-renovação e cashback (modelo antigo).
</commit_message>
<xml_diff>
--- a/assets/contratos/contrato-starter.docx
+++ b/assets/contratos/contrato-starter.docx
@@ -184,7 +184,7 @@
           <w:sz w:val="22"/>
           <w:szCs w:val="22"/>
         </w:rPr>
-        <w:t xml:space="preserve">PLANO STARTER</w:t>
+        <w:t>PLANO STARTER</w:t>
       </w:r>
       <w:r>
         <w:rPr>
@@ -202,7 +202,7 @@
           <w:sz w:val="22"/>
           <w:szCs w:val="22"/>
         </w:rPr>
-        <w:t xml:space="preserve">{duracao_meses}</w:t>
+        <w:t xml:space="preserve">{duracao_meses} meses</w:t>
       </w:r>
       <w:r>
         <w:rPr>
@@ -224,104 +224,131 @@
           <w:sz w:val="22"/>
           <w:szCs w:val="22"/>
         </w:rPr>
-        <w:t xml:space="preserve">a) Gestão de Tráfego Pago Especializada (Meta Ads);</w:t>
-      </w:r>
-    </w:p>
-    <w:p>
-      <w:pPr>
-        <w:spacing w:after="60"/>
-        <w:ind w:left="360"/>
-      </w:pPr>
-      <w:r>
-        <w:rPr>
-          <w:rFonts w:ascii="Arial" w:cs="Arial" w:eastAsia="Arial" w:hAnsi="Arial"/>
-          <w:sz w:val="22"/>
-          <w:szCs w:val="22"/>
-        </w:rPr>
-        <w:t xml:space="preserve">b) Edição de até 3 (três) vídeos para tráfego;</w:t>
-      </w:r>
-    </w:p>
-    <w:p>
-      <w:pPr>
-        <w:spacing w:after="60"/>
-        <w:ind w:left="360"/>
-      </w:pPr>
-      <w:r>
-        <w:rPr>
-          <w:rFonts w:ascii="Arial" w:cs="Arial" w:eastAsia="Arial" w:hAnsi="Arial"/>
-          <w:sz w:val="22"/>
-          <w:szCs w:val="22"/>
-        </w:rPr>
-        <w:t xml:space="preserve">c) 1 (uma) Otimização do Cardápio Digital;</w:t>
-      </w:r>
-    </w:p>
-    <w:p>
-      <w:pPr>
-        <w:spacing w:after="60"/>
-        <w:ind w:left="360"/>
-      </w:pPr>
-      <w:r>
-        <w:rPr>
-          <w:rFonts w:ascii="Arial" w:cs="Arial" w:eastAsia="Arial" w:hAnsi="Arial"/>
-          <w:sz w:val="22"/>
-          <w:szCs w:val="22"/>
-        </w:rPr>
-        <w:t xml:space="preserve">d) 3 (três) Otimizações de Tráfego nos dias 15, 30 e 45 de serviço;</w:t>
-      </w:r>
-    </w:p>
-    <w:p>
-      <w:pPr>
-        <w:spacing w:after="60"/>
-        <w:ind w:left="360"/>
-      </w:pPr>
-      <w:r>
-        <w:rPr>
-          <w:rFonts w:ascii="Arial" w:cs="Arial" w:eastAsia="Arial" w:hAnsi="Arial"/>
-          <w:sz w:val="22"/>
-          <w:szCs w:val="22"/>
-        </w:rPr>
-        <w:t xml:space="preserve">e) 1 (uma) Campanha de vendas com 3 (três) anúncios;</w:t>
-      </w:r>
-    </w:p>
-    <w:p>
-      <w:pPr>
-        <w:spacing w:after="60"/>
-        <w:ind w:left="360"/>
-      </w:pPr>
-      <w:r>
-        <w:rPr>
-          <w:rFonts w:ascii="Arial" w:cs="Arial" w:eastAsia="Arial" w:hAnsi="Arial"/>
-          <w:sz w:val="22"/>
-          <w:szCs w:val="22"/>
-        </w:rPr>
-        <w:t xml:space="preserve">f) Suporte via WhatsApp em horário comercial;</w:t>
-      </w:r>
-    </w:p>
-    <w:p>
-      <w:pPr>
-        <w:spacing w:after="60"/>
-        <w:ind w:left="360"/>
-      </w:pPr>
-      <w:r>
-        <w:rPr>
-          <w:rFonts w:ascii="Arial" w:cs="Arial" w:eastAsia="Arial" w:hAnsi="Arial"/>
-          <w:sz w:val="22"/>
-          <w:szCs w:val="22"/>
-        </w:rPr>
-        <w:t xml:space="preserve">g) Relatório semanal de métricas.</w:t>
-      </w:r>
-    </w:p>
-    <w:p>
-      <w:pPr>
-        <w:spacing w:after="160"/>
-      </w:pPr>
-      <w:r>
-        <w:rPr>
-          <w:rFonts w:ascii="Arial" w:cs="Arial" w:eastAsia="Arial" w:hAnsi="Arial"/>
-          <w:sz w:val="22"/>
-          <w:szCs w:val="22"/>
-        </w:rPr>
-        <w:t xml:space="preserve">1.3. Os valores investidos em mídia paga não estão inclusos neste contrato, sendo de responsabilidade exclusiva da CONTRATANTE.</w:t>
+        <w:t>a) Gestão de Tráfego Pago Especializada;</w:t>
+      </w:r>
+    </w:p>
+    <w:p>
+      <w:pPr>
+        <w:spacing w:after="60"/>
+        <w:ind w:left="360"/>
+      </w:pPr>
+      <w:r>
+        <w:rPr>
+          <w:rFonts w:ascii="Arial" w:cs="Arial" w:eastAsia="Arial" w:hAnsi="Arial"/>
+          <w:sz w:val="22"/>
+          <w:szCs w:val="22"/>
+        </w:rPr>
+        <w:t>b) Edição de até 5 (cinco) criativos para tráfego, mensalmente;</w:t>
+      </w:r>
+    </w:p>
+    <w:p>
+      <w:pPr>
+        <w:spacing w:after="60"/>
+        <w:ind w:left="360"/>
+      </w:pPr>
+      <w:r>
+        <w:rPr>
+          <w:rFonts w:ascii="Arial" w:cs="Arial" w:eastAsia="Arial" w:hAnsi="Arial"/>
+          <w:sz w:val="22"/>
+          <w:szCs w:val="22"/>
+        </w:rPr>
+        <w:t>c) 1 (uma) Otimização do Cardápio Digital;</w:t>
+      </w:r>
+    </w:p>
+    <w:p>
+      <w:pPr>
+        <w:spacing w:after="60"/>
+        <w:ind w:left="360"/>
+      </w:pPr>
+      <w:r>
+        <w:rPr>
+          <w:rFonts w:ascii="Arial" w:cs="Arial" w:eastAsia="Arial" w:hAnsi="Arial"/>
+          <w:sz w:val="22"/>
+          <w:szCs w:val="22"/>
+        </w:rPr>
+        <w:t>d) Estratégias focadas na retenção dos clientes;</w:t>
+      </w:r>
+    </w:p>
+    <w:p>
+      <w:pPr>
+        <w:spacing w:after="60"/>
+        <w:ind w:left="360"/>
+      </w:pPr>
+      <w:r>
+        <w:rPr>
+          <w:rFonts w:ascii="Arial" w:cs="Arial" w:eastAsia="Arial" w:hAnsi="Arial"/>
+          <w:sz w:val="22"/>
+          <w:szCs w:val="22"/>
+        </w:rPr>
+        <w:t>e) Estratégias focadas na captação de novos clientes;</w:t>
+      </w:r>
+    </w:p>
+    <w:p>
+      <w:pPr>
+        <w:spacing w:after="60"/>
+        <w:ind w:left="360"/>
+      </w:pPr>
+      <w:r>
+        <w:rPr>
+          <w:rFonts w:ascii="Arial" w:cs="Arial" w:eastAsia="Arial" w:hAnsi="Arial"/>
+          <w:sz w:val="22"/>
+          <w:szCs w:val="22"/>
+        </w:rPr>
+        <w:t>f) Suporte via WhatsApp em horário comercial;</w:t>
+      </w:r>
+    </w:p>
+    <w:p>
+      <w:pPr>
+        <w:spacing w:after="60"/>
+        <w:ind w:left="360"/>
+      </w:pPr>
+      <w:r>
+        <w:rPr>
+          <w:rFonts w:ascii="Arial" w:cs="Arial" w:eastAsia="Arial" w:hAnsi="Arial"/>
+          <w:sz w:val="22"/>
+          <w:szCs w:val="22"/>
+        </w:rPr>
+        <w:t>g) Relatórios semanais das métricas.</w:t>
+      </w:r>
+    </w:p>
+    <w:p>
+      <w:pPr>
+        <w:spacing w:after="60"/>
+      </w:pPr>
+      <w:r>
+        <w:rPr>
+          <w:rFonts w:ascii="Arial" w:cs="Arial" w:eastAsia="Arial" w:hAnsi="Arial"/>
+          <w:sz w:val="22"/>
+          <w:szCs w:val="22"/>
+        </w:rPr>
+        <w:t xml:space="preserve">{#temAdicionais}1.2. Os serviços adicionais opcionais contratados pela CONTRATANTE, cobrados à parte, são os seguintes:</w:t>
+      </w:r>
+    </w:p>
+    <w:p>
+      <w:pPr>
+        <w:spacing w:after="60"/>
+        <w:ind w:left="360"/>
+      </w:pPr>
+      <w:r>
+        <w:rPr>
+          <w:rFonts w:ascii="Arial" w:cs="Arial" w:eastAsia="Arial" w:hAnsi="Arial"/>
+          <w:sz w:val="22"/>
+          <w:szCs w:val="22"/>
+        </w:rPr>
+        <w:t xml:space="preserve">{#adicionaisSel}{linha}{/adicionaisSel}{/temAdicionais}</w:t>
+      </w:r>
+    </w:p>
+    <w:p>
+      <w:pPr>
+        <w:spacing w:after="160"/>
+      </w:pPr>
+      <w:r>
+        <w:rPr>
+          <w:rFonts w:ascii="Arial" w:cs="Arial" w:eastAsia="Arial" w:hAnsi="Arial"/>
+          <w:sz w:val="22"/>
+          <w:szCs w:val="22"/>
+        </w:rPr>
+        <w:t xml:space="preserve">{clausulaMidia}. Os valores investidos em mídia paga não estão inclusos neste contrato, sendo de responsabilidade exclusiva da CONTRATANTE.</w:t>
       </w:r>
     </w:p>
     <w:p>
@@ -543,232 +570,6 @@
     </w:p>
     <w:p>
       <w:pPr>
-        <w:spacing w:before="120" w:after="60"/>
-      </w:pPr>
-      <w:r>
-        <w:rPr>
-          <w:rFonts w:ascii="Arial" w:cs="Arial" w:eastAsia="Arial" w:hAnsi="Arial"/>
-          <w:b/>
-          <w:bCs/>
-          <w:sz w:val="22"/>
-          <w:szCs w:val="22"/>
-        </w:rPr>
-        <w:t>CLÁUSULA 5ª – DO VALOR, FORMA DE PAGAMENTO E VIGÊNCIA</w:t>
-      </w:r>
-    </w:p>
-    <w:p>
-      <w:pPr>
-        <w:spacing w:after="60"/>
-      </w:pPr>
-      <w:r>
-        <w:rPr>
-          <w:rFonts w:ascii="Arial" w:cs="Arial" w:eastAsia="Arial" w:hAnsi="Arial"/>
-          <w:sz w:val="22"/>
-          <w:szCs w:val="22"/>
-        </w:rPr>
-        <w:t xml:space="preserve">5.1. Pelos serviços prestados, a CONTRATANTE pagará à CONTRATADA {forma_pagamento}</w:t>
-      </w:r>
-    </w:p>
-    <w:p>
-      <w:pPr>
-        <w:spacing w:after="60"/>
-      </w:pPr>
-      <w:r>
-        <w:rPr>
-          <w:rFonts w:ascii="Arial" w:cs="Arial" w:eastAsia="Arial" w:hAnsi="Arial"/>
-          <w:sz w:val="22"/>
-          <w:szCs w:val="22"/>
-        </w:rPr>
-        <w:t xml:space="preserve">5.2. A confirmação do pagamento é condição indispensável para o início e continuidade da prestação dos serviços pela CONTRATADA, podendo a CONTRATADA iniciar previamente atividades internas de planejamento, organização e estruturação estratégica após a assinatura deste instrumento.</w:t>
-      </w:r>
-    </w:p>
-    <w:p>
-      <w:pPr>
-        <w:spacing w:after="60"/>
-      </w:pPr>
-      <w:r>
-        <w:rPr>
-          <w:rFonts w:ascii="Arial" w:cs="Arial" w:eastAsia="Arial" w:hAnsi="Arial"/>
-          <w:sz w:val="22"/>
-          <w:szCs w:val="22"/>
-        </w:rPr>
-        <w:t xml:space="preserve">5.3. O parcelamento do pagamento constitui mera facilidade concedida pela CONTRATADA e não descaracteriza a obrigação integral da CONTRATANTE em relação ao valor total do contrato firmado.</w:t>
-      </w:r>
-    </w:p>
-    <w:p>
-      <w:pPr>
-        <w:spacing w:after="60"/>
-      </w:pPr>
-      <w:r>
-        <w:rPr>
-          <w:rFonts w:ascii="Arial" w:cs="Arial" w:eastAsia="Arial" w:hAnsi="Arial"/>
-          <w:sz w:val="22"/>
-          <w:szCs w:val="22"/>
-        </w:rPr>
-        <w:t xml:space="preserve">5.4. Em caso de inadimplência, atraso, cancelamento, contestação de pagamento (chargeback) ou qualquer interrupção relacionada às cobranças contratadas, a CONTRATANTE permanecerá integralmente responsável pelos valores devidos, obrigando-se à regularização imediata por meio indicado pela CONTRATADA.</w:t>
-      </w:r>
-    </w:p>
-    <w:p>
-      <w:pPr>
-        <w:spacing w:after="60"/>
-      </w:pPr>
-      <w:r>
-        <w:rPr>
-          <w:rFonts w:ascii="Arial" w:cs="Arial" w:eastAsia="Arial" w:hAnsi="Arial"/>
-          <w:sz w:val="22"/>
-          <w:szCs w:val="22"/>
-        </w:rPr>
-        <w:t xml:space="preserve">5.5. A inadimplência autoriza a CONTRATADA, independentemente de aviso prévio, a:</w:t>
-      </w:r>
-    </w:p>
-    <w:p>
-      <w:pPr>
-        <w:spacing w:after="60"/>
-        <w:ind w:left="360"/>
-      </w:pPr>
-      <w:r>
-        <w:rPr>
-          <w:rFonts w:ascii="Arial" w:cs="Arial" w:eastAsia="Arial" w:hAnsi="Arial"/>
-          <w:sz w:val="22"/>
-          <w:szCs w:val="22"/>
-        </w:rPr>
-        <w:t xml:space="preserve">a) suspender imediatamente a prestação dos serviços até a regularização dos pagamentos;</w:t>
-      </w:r>
-    </w:p>
-    <w:p>
-      <w:pPr>
-        <w:spacing w:after="60"/>
-        <w:ind w:left="360"/>
-      </w:pPr>
-      <w:r>
-        <w:rPr>
-          <w:rFonts w:ascii="Arial" w:cs="Arial" w:eastAsia="Arial" w:hAnsi="Arial"/>
-          <w:sz w:val="22"/>
-          <w:szCs w:val="22"/>
-        </w:rPr>
-        <w:t xml:space="preserve">b) interromper campanhas, anúncios, publicações, relatórios e demais entregas vinculadas ao contrato;</w:t>
-      </w:r>
-    </w:p>
-    <w:p>
-      <w:pPr>
-        <w:spacing w:after="60"/>
-        <w:ind w:left="360"/>
-      </w:pPr>
-      <w:r>
-        <w:rPr>
-          <w:rFonts w:ascii="Arial" w:cs="Arial" w:eastAsia="Arial" w:hAnsi="Arial"/>
-          <w:sz w:val="22"/>
-          <w:szCs w:val="22"/>
-        </w:rPr>
-        <w:t xml:space="preserve">c) adotar as medidas administrativas e judiciais cabíveis para cobrança dos valores em aberto.</w:t>
-      </w:r>
-    </w:p>
-    <w:p>
-      <w:pPr>
-        <w:spacing w:after="60"/>
-      </w:pPr>
-      <w:r>
-        <w:rPr>
-          <w:rFonts w:ascii="Arial" w:cs="Arial" w:eastAsia="Arial" w:hAnsi="Arial"/>
-          <w:sz w:val="22"/>
-          <w:szCs w:val="22"/>
-        </w:rPr>
-        <w:t xml:space="preserve">5.6. Em caso de atraso no pagamento, poderão incidir multa moratória de 2% (dois por cento) sobre o valor devido, juros de mora de 1% (um por cento) ao mês e correção monetária pelo índice oficial aplicável.</w:t>
-      </w:r>
-    </w:p>
-    <w:p>
-      <w:pPr>
-        <w:spacing w:after="60"/>
-      </w:pPr>
-      <w:r>
-        <w:rPr>
-          <w:rFonts w:ascii="Arial" w:cs="Arial" w:eastAsia="Arial" w:hAnsi="Arial"/>
-          <w:sz w:val="22"/>
-          <w:szCs w:val="22"/>
-        </w:rPr>
-        <w:t xml:space="preserve">5.7. Os valores pagos são contraprestação pelos serviços efetivamente prestados, pela disponibilidade da equipe, pelo planejamento estratégico e pela reserva de capacidade operacional desde o início da vigência contratual.</w:t>
-      </w:r>
-    </w:p>
-    <w:p>
-      <w:pPr>
-        <w:spacing w:after="60"/>
-      </w:pPr>
-      <w:r>
-        <w:rPr>
-          <w:rFonts w:ascii="Arial" w:cs="Arial" w:eastAsia="Arial" w:hAnsi="Arial"/>
-          <w:sz w:val="22"/>
-          <w:szCs w:val="22"/>
-        </w:rPr>
-        <w:t xml:space="preserve">5.8. Os valores já pagos não serão objeto de devolução, reembolso ou compensação, exceto nas hipóteses expressamente previstas em lei.</w:t>
-      </w:r>
-    </w:p>
-    <w:p>
-      <w:pPr>
-        <w:spacing w:after="60"/>
-      </w:pPr>
-      <w:r>
-        <w:rPr>
-          <w:rFonts w:ascii="Arial" w:cs="Arial" w:eastAsia="Arial" w:hAnsi="Arial"/>
-          <w:sz w:val="22"/>
-          <w:szCs w:val="22"/>
-        </w:rPr>
-        <w:t xml:space="preserve">5.9. O presente contrato possui prazo fixo e improrrogável de 45 (quarenta e cinco) dias corridos, contados da data de início prevista na Cláusula 6ª, e não prevê renovação automática. O encerramento do prazo extingue automaticamente as obrigações de prestação de serviços da CONTRATADA.</w:t>
-      </w:r>
-    </w:p>
-    <w:p>
-      <w:pPr>
-        <w:spacing w:after="60"/>
-      </w:pPr>
-      <w:r>
-        <w:rPr>
-          <w:rFonts w:ascii="Arial" w:cs="Arial" w:eastAsia="Arial" w:hAnsi="Arial"/>
-          <w:sz w:val="22"/>
-          <w:szCs w:val="22"/>
-        </w:rPr>
-        <w:t xml:space="preserve">5.10. Tendo em vista que o valor contratado foi integralmente avençado sob a modalidade de Valor Total de Contrato (TCV), o cancelamento ou rescisão antecipada por parte da CONTRATANTE não gera direito a reembolso, restituição ou compensação dos valores pagos ou devidos.</w:t>
-      </w:r>
-    </w:p>
-    <w:p>
-      <w:pPr>
-        <w:spacing w:after="60"/>
-      </w:pPr>
-      <w:r>
-        <w:rPr>
-          <w:rFonts w:ascii="Arial" w:cs="Arial" w:eastAsia="Arial" w:hAnsi="Arial"/>
-          <w:sz w:val="22"/>
-          <w:szCs w:val="22"/>
-        </w:rPr>
-        <w:t xml:space="preserve">5.11. Em caso de rescisão antecipada, a totalidade do saldo remanescente do valor total do contrato permanecerá devida e exigível pela CONTRATADA, independentemente da interrupção da prestação dos serviços.</w:t>
-      </w:r>
-    </w:p>
-    <w:p>
-      <w:pPr>
-        <w:spacing w:after="60"/>
-      </w:pPr>
-      <w:r>
-        <w:rPr>
-          <w:rFonts w:ascii="Arial" w:cs="Arial" w:eastAsia="Arial" w:hAnsi="Arial"/>
-          <w:sz w:val="22"/>
-          <w:szCs w:val="22"/>
-        </w:rPr>
-        <w:t xml:space="preserve">5.12. O Plano Starter não admite renovação. Ao término dos 45 (quarenta e cinco) dias, o CONTRATANTE que desejar dar continuidade aos serviços da CONTRATADA deverá contratar o Plano Premium ou o Plano Elite, podendo usufruir do benefício de cashback previsto na Cláusula 10ª deste instrumento.</w:t>
-      </w:r>
-    </w:p>
-    <w:p>
-      <w:pPr>
-        <w:spacing w:after="60"/>
-      </w:pPr>
-      <w:r>
-        <w:rPr>
-          <w:rFonts w:ascii="Arial" w:cs="Arial" w:eastAsia="Arial" w:hAnsi="Arial"/>
-          <w:sz w:val="22"/>
-          <w:szCs w:val="22"/>
-        </w:rPr>
-        <w:t xml:space="preserve"/>
-      </w:r>
-    </w:p>
-    <w:p>
-      <w:pPr>
         <w:pStyle w:val="Heading1"/>
         <w:spacing w:after="160" w:before="240"/>
       </w:pPr>
@@ -780,26 +581,192 @@
           <w:sz w:val="28"/>
           <w:szCs w:val="28"/>
         </w:rPr>
-        <w:t xml:space="preserve">CLÁUSULA 6ª – DA VIGÊNCIA E PRAZO MÍNIMO</w:t>
-      </w:r>
-    </w:p>
-    <w:p>
-      <w:pPr>
-        <w:spacing w:after="160"/>
-      </w:pPr>
-      <w:r>
-        <w:rPr>
-          <w:rFonts w:ascii="Arial" w:cs="Arial" w:eastAsia="Arial" w:hAnsi="Arial"/>
-          <w:sz w:val="22"/>
-          <w:szCs w:val="22"/>
-        </w:rPr>
-        <w:t xml:space="preserve">6.1. O presente contrato terá vigência inicial de </w:t>
-      </w:r>
-      <w:r>
-        <w:rPr>
-          <w:rFonts w:ascii="Arial" w:cs="Arial" w:eastAsia="Arial" w:hAnsi="Arial"/>
-          <w:b/>
-          <w:bCs/>
+        <w:t xml:space="preserve">CLÁUSULA 5ª – DO VALOR, FORMA DE PAGAMENTO E VIGÊNCIA</w:t>
+      </w:r>
+    </w:p>
+    <w:p>
+      <w:pPr>
+        <w:spacing w:after="160"/>
+      </w:pPr>
+      <w:r>
+        <w:rPr>
+          <w:rFonts w:ascii="Arial" w:cs="Arial" w:eastAsia="Arial" w:hAnsi="Arial"/>
+          <w:sz w:val="22"/>
+          <w:szCs w:val="22"/>
+        </w:rPr>
+        <w:t xml:space="preserve">5.1. Pelos serviços prestados, a CONTRATANTE pagará à CONTRATADA </w:t>
+      </w:r>
+      <w:r>
+        <w:rPr>
+          <w:rFonts w:ascii="Arial" w:cs="Arial" w:eastAsia="Arial" w:hAnsi="Arial"/>
+          <w:sz w:val="22"/>
+          <w:szCs w:val="22"/>
+        </w:rPr>
+        <w:t xml:space="preserve">{forma_pagamento}</w:t>
+      </w:r>
+    </w:p>
+    <w:p>
+      <w:pPr>
+        <w:spacing w:after="160"/>
+      </w:pPr>
+      <w:r>
+        <w:rPr>
+          <w:rFonts w:ascii="Arial" w:cs="Arial" w:eastAsia="Arial" w:hAnsi="Arial"/>
+          <w:sz w:val="22"/>
+          <w:szCs w:val="22"/>
+        </w:rPr>
+        <w:t xml:space="preserve">5.2. A confirmação do pagamento é condição indispensável para o início e continuidade da prestação dos serviços pela CONTRATADA, podendo a CONTRATADA iniciar previamente atividades internas de planejamento, organização e estruturação estratégica após a assinatura deste instrumento.</w:t>
+      </w:r>
+    </w:p>
+    <w:p>
+      <w:pPr>
+        <w:spacing w:after="160"/>
+      </w:pPr>
+      <w:r>
+        <w:rPr>
+          <w:rFonts w:ascii="Arial" w:cs="Arial" w:eastAsia="Arial" w:hAnsi="Arial"/>
+          <w:sz w:val="22"/>
+          <w:szCs w:val="22"/>
+        </w:rPr>
+        <w:t xml:space="preserve">5.3. O parcelamento ou fracionamento do pagamento constitui mera facilidade concedida pela CONTRATADA e não descaracteriza a obrigação integral da CONTRATANTE em relação ao valor total do contrato firmado.</w:t>
+      </w:r>
+    </w:p>
+    <w:p>
+      <w:pPr>
+        <w:spacing w:after="160"/>
+      </w:pPr>
+      <w:r>
+        <w:rPr>
+          <w:rFonts w:ascii="Arial" w:cs="Arial" w:eastAsia="Arial" w:hAnsi="Arial"/>
+          <w:sz w:val="22"/>
+          <w:szCs w:val="22"/>
+        </w:rPr>
+        <w:t xml:space="preserve">5.4. Em caso de inadimplência, atraso, não processamento, cancelamento de cobrança, contestação de pagamento (chargeback), bloqueio de pagamento ou qualquer interrupção relacionada às cobranças contratadas, a CONTRATANTE permanecerá integralmente responsável pelos valores devidos, obrigando-se à regularização imediata por meio indicado pela CONTRATADA.</w:t>
+      </w:r>
+    </w:p>
+    <w:p>
+      <w:pPr>
+        <w:spacing w:after="160"/>
+      </w:pPr>
+      <w:r>
+        <w:rPr>
+          <w:rFonts w:ascii="Arial" w:cs="Arial" w:eastAsia="Arial" w:hAnsi="Arial"/>
+          <w:sz w:val="22"/>
+          <w:szCs w:val="22"/>
+        </w:rPr>
+        <w:t xml:space="preserve">5.5. A inadimplência autoriza a CONTRATADA, independentemente de aviso prévio, a:</w:t>
+      </w:r>
+    </w:p>
+    <w:p>
+      <w:pPr>
+        <w:spacing w:after="60"/>
+        <w:ind w:left="360"/>
+      </w:pPr>
+      <w:r>
+        <w:rPr>
+          <w:rFonts w:ascii="Arial" w:cs="Arial" w:eastAsia="Arial" w:hAnsi="Arial"/>
+          <w:sz w:val="22"/>
+          <w:szCs w:val="22"/>
+        </w:rPr>
+        <w:t xml:space="preserve">a) suspender imediatamente a prestação dos serviços até a regularização dos pagamentos;</w:t>
+      </w:r>
+    </w:p>
+    <w:p>
+      <w:pPr>
+        <w:spacing w:after="60"/>
+        <w:ind w:left="360"/>
+      </w:pPr>
+      <w:r>
+        <w:rPr>
+          <w:rFonts w:ascii="Arial" w:cs="Arial" w:eastAsia="Arial" w:hAnsi="Arial"/>
+          <w:sz w:val="22"/>
+          <w:szCs w:val="22"/>
+        </w:rPr>
+        <w:t xml:space="preserve">b) interromper campanhas, anúncios, publicações, relatórios, treinamentos, consultorias, reuniões, acessos e demais entregas vinculadas ao contrato;</w:t>
+      </w:r>
+    </w:p>
+    <w:p>
+      <w:pPr>
+        <w:spacing w:after="60"/>
+        <w:ind w:left="360"/>
+      </w:pPr>
+      <w:r>
+        <w:rPr>
+          <w:rFonts w:ascii="Arial" w:cs="Arial" w:eastAsia="Arial" w:hAnsi="Arial"/>
+          <w:sz w:val="22"/>
+          <w:szCs w:val="22"/>
+        </w:rPr>
+        <w:t xml:space="preserve">c) bloquear acessos a plataformas, áreas de membros, materiais estratégicos, treinamentos e demais ativos disponibilizados durante a vigência contratual;</w:t>
+      </w:r>
+    </w:p>
+    <w:p>
+      <w:pPr>
+        <w:spacing w:after="60"/>
+        <w:ind w:left="360"/>
+      </w:pPr>
+      <w:r>
+        <w:rPr>
+          <w:rFonts w:ascii="Arial" w:cs="Arial" w:eastAsia="Arial" w:hAnsi="Arial"/>
+          <w:sz w:val="22"/>
+          <w:szCs w:val="22"/>
+        </w:rPr>
+        <w:t xml:space="preserve">d) adotar as medidas administrativas e judiciais cabíveis para cobrança dos valores em aberto.</w:t>
+      </w:r>
+    </w:p>
+    <w:p>
+      <w:pPr>
+        <w:spacing w:after="160"/>
+      </w:pPr>
+      <w:r>
+        <w:rPr>
+          <w:rFonts w:ascii="Arial" w:cs="Arial" w:eastAsia="Arial" w:hAnsi="Arial"/>
+          <w:sz w:val="22"/>
+          <w:szCs w:val="22"/>
+        </w:rPr>
+        <w:t xml:space="preserve">5.6. Em caso de atraso no pagamento, poderão incidir multa moratória de 2% (dois por cento) sobre o valor devido, juros de mora de 1% (um por cento) ao mês e correção monetária pelo índice oficial aplicável, sem prejuízo das demais medidas previstas neste contrato.</w:t>
+      </w:r>
+    </w:p>
+    <w:p>
+      <w:pPr>
+        <w:spacing w:after="160"/>
+      </w:pPr>
+      <w:r>
+        <w:rPr>
+          <w:rFonts w:ascii="Arial" w:cs="Arial" w:eastAsia="Arial" w:hAnsi="Arial"/>
+          <w:sz w:val="22"/>
+          <w:szCs w:val="22"/>
+        </w:rPr>
+        <w:t xml:space="preserve">5.7. Os valores pagos serão considerados contraprestação pelos serviços efetivamente prestados, pela disponibilidade da equipe, pela estrutura operacional, pelo planejamento estratégico, pela alocação de recursos, pela reserva de capacidade operacional e pelas atividades executadas desde o início da vigência contratual.</w:t>
+      </w:r>
+    </w:p>
+    <w:p>
+      <w:pPr>
+        <w:spacing w:after="160"/>
+      </w:pPr>
+      <w:r>
+        <w:rPr>
+          <w:rFonts w:ascii="Arial" w:cs="Arial" w:eastAsia="Arial" w:hAnsi="Arial"/>
+          <w:sz w:val="22"/>
+          <w:szCs w:val="22"/>
+        </w:rPr>
+        <w:t xml:space="preserve">5.8. Os valores já pagos não serão objeto de devolução, reembolso ou compensação, exceto nas hipóteses expressamente previstas em lei.</w:t>
+      </w:r>
+    </w:p>
+    <w:p>
+      <w:pPr>
+        <w:spacing w:after="160"/>
+      </w:pPr>
+      <w:r>
+        <w:rPr>
+          <w:rFonts w:ascii="Arial" w:cs="Arial" w:eastAsia="Arial" w:hAnsi="Arial"/>
+          <w:sz w:val="22"/>
+          <w:szCs w:val="22"/>
+        </w:rPr>
+        <w:t xml:space="preserve">5.9. O presente contrato possui prazo mínimo de vigência de </w:t>
+      </w:r>
+      <w:r>
+        <w:rPr>
+          <w:rFonts w:ascii="Arial" w:cs="Arial" w:eastAsia="Arial" w:hAnsi="Arial"/>
           <w:sz w:val="22"/>
           <w:szCs w:val="22"/>
         </w:rPr>
@@ -811,43 +778,124 @@
           <w:sz w:val="22"/>
           <w:szCs w:val="22"/>
         </w:rPr>
-        <w:t xml:space="preserve">, com início em </w:t>
-      </w:r>
-      <w:r>
-        <w:rPr>
-          <w:rFonts w:ascii="Arial" w:cs="Arial" w:eastAsia="Arial" w:hAnsi="Arial"/>
-          <w:b/>
-          <w:bCs/>
-          <w:sz w:val="22"/>
-          <w:szCs w:val="22"/>
-        </w:rPr>
-        <w:t xml:space="preserve">{data_inicio}</w:t>
-      </w:r>
-      <w:r>
-        <w:rPr>
-          <w:rFonts w:ascii="Arial" w:cs="Arial" w:eastAsia="Arial" w:hAnsi="Arial"/>
-          <w:sz w:val="22"/>
-          <w:szCs w:val="22"/>
-        </w:rPr>
-        <w:t xml:space="preserve"> e término em </w:t>
-      </w:r>
-      <w:r>
-        <w:rPr>
-          <w:rFonts w:ascii="Arial" w:cs="Arial" w:eastAsia="Arial" w:hAnsi="Arial"/>
-          <w:b/>
-          <w:bCs/>
-          <w:sz w:val="22"/>
-          <w:szCs w:val="22"/>
-        </w:rPr>
-        <w:t xml:space="preserve">{data_fim}</w:t>
-      </w:r>
-      <w:r>
-        <w:rPr>
-          <w:rFonts w:ascii="Arial" w:cs="Arial" w:eastAsia="Arial" w:hAnsi="Arial"/>
-          <w:sz w:val="22"/>
-          <w:szCs w:val="22"/>
-        </w:rPr>
-        <w:t xml:space="preserve">.</w:t>
+        <w:t xml:space="preserve"> meses, permanecendo as partes vinculadas ao período integral contratado.</w:t>
+      </w:r>
+    </w:p>
+    <w:p>
+      <w:pPr>
+        <w:spacing w:after="160"/>
+      </w:pPr>
+      <w:r>
+        <w:rPr>
+          <w:rFonts w:ascii="Arial" w:cs="Arial" w:eastAsia="Arial" w:hAnsi="Arial"/>
+          <w:sz w:val="22"/>
+          <w:szCs w:val="22"/>
+        </w:rPr>
+        <w:t xml:space="preserve">{#mmr}</w:t>
+      </w:r>
+    </w:p>
+    <w:p>
+      <w:pPr>
+        <w:spacing w:after="160"/>
+      </w:pPr>
+      <w:r>
+        <w:rPr>
+          <w:rFonts w:ascii="Arial" w:cs="Arial" w:eastAsia="Arial" w:hAnsi="Arial"/>
+          <w:sz w:val="22"/>
+          <w:szCs w:val="22"/>
+        </w:rPr>
+        <w:t xml:space="preserve">5.10. Caso a CONTRATANTE deseje encerrar o contrato sem incidência de multa, deverá comunicar formalmente a CONTRATADA com antecedência mínima de 20 (vinte) dias corridos do próximo vencimento.</w:t>
+      </w:r>
+    </w:p>
+    <w:p>
+      <w:pPr>
+        <w:spacing w:after="160"/>
+      </w:pPr>
+      <w:r>
+        <w:rPr>
+          <w:rFonts w:ascii="Arial" w:cs="Arial" w:eastAsia="Arial" w:hAnsi="Arial"/>
+          <w:sz w:val="22"/>
+          <w:szCs w:val="22"/>
+        </w:rPr>
+        <w:t xml:space="preserve">5.11. Na ausência do aviso prévio previsto na cláusula anterior, ou em caso de rescisão antecipada durante a vigência contratual, será devida multa compensatória correspondente a 50% (cinquenta por cento) do saldo contratual restante até o término do contrato.</w:t>
+      </w:r>
+    </w:p>
+    <w:p>
+      <w:pPr>
+        <w:spacing w:after="160"/>
+      </w:pPr>
+      <w:r>
+        <w:rPr>
+          <w:rFonts w:ascii="Arial" w:cs="Arial" w:eastAsia="Arial" w:hAnsi="Arial"/>
+          <w:sz w:val="22"/>
+          <w:szCs w:val="22"/>
+        </w:rPr>
+        <w:t xml:space="preserve">{/mmr}</w:t>
+      </w:r>
+    </w:p>
+    <w:p>
+      <w:pPr>
+        <w:spacing w:after="160"/>
+      </w:pPr>
+      <w:r>
+        <w:rPr>
+          <w:rFonts w:ascii="Arial" w:cs="Arial" w:eastAsia="Arial" w:hAnsi="Arial"/>
+          <w:sz w:val="22"/>
+          <w:szCs w:val="22"/>
+        </w:rPr>
+        <w:t xml:space="preserve">{^mmr}</w:t>
+      </w:r>
+    </w:p>
+    <w:p>
+      <w:pPr>
+        <w:spacing w:after="160"/>
+      </w:pPr>
+      <w:r>
+        <w:rPr>
+          <w:rFonts w:ascii="Arial" w:cs="Arial" w:eastAsia="Arial" w:hAnsi="Arial"/>
+          <w:sz w:val="22"/>
+          <w:szCs w:val="22"/>
+        </w:rPr>
+        <w:t xml:space="preserve">5.10. Tendo em vista que o valor contratado foi integralmente avençado sob a modalidade de Valor Total de Contrato (TCV), o cancelamento ou a rescisão antecipada por parte da CONTRATANTE não gera direito a reembolso, restituição ou compensação dos valores pagos ou devidos, nos termos da cláusula 5.8.</w:t>
+      </w:r>
+    </w:p>
+    <w:p>
+      <w:pPr>
+        <w:spacing w:after="160"/>
+      </w:pPr>
+      <w:r>
+        <w:rPr>
+          <w:rFonts w:ascii="Arial" w:cs="Arial" w:eastAsia="Arial" w:hAnsi="Arial"/>
+          <w:sz w:val="22"/>
+          <w:szCs w:val="22"/>
+        </w:rPr>
+        <w:t xml:space="preserve">5.11. Em caso de cancelamento ou rescisão antecipada, a totalidade do saldo remanescente do valor total do contrato permanecerá devida e exigível pela CONTRATADA, independentemente da eventual interrupção da prestação dos serviços.</w:t>
+      </w:r>
+    </w:p>
+    <w:p>
+      <w:pPr>
+        <w:spacing w:after="160"/>
+      </w:pPr>
+      <w:r>
+        <w:rPr>
+          <w:rFonts w:ascii="Arial" w:cs="Arial" w:eastAsia="Arial" w:hAnsi="Arial"/>
+          <w:sz w:val="22"/>
+          <w:szCs w:val="22"/>
+        </w:rPr>
+        <w:t xml:space="preserve">{/mmr}</w:t>
+      </w:r>
+    </w:p>
+    <w:p>
+      <w:pPr>
+        <w:spacing w:after="160"/>
+      </w:pPr>
+      <w:r>
+        <w:rPr>
+          <w:rFonts w:ascii="Arial" w:cs="Arial" w:eastAsia="Arial" w:hAnsi="Arial"/>
+          <w:sz w:val="22"/>
+          <w:szCs w:val="22"/>
+        </w:rPr>
+        <w:t xml:space="preserve">5.12. A rescisão contratual, independentemente do motivo, não desobriga a CONTRATANTE do pagamento dos valores vencidos até a data do encerramento efetivo da relação contratual.</w:t>
       </w:r>
     </w:p>
     <w:p>
@@ -863,38 +911,74 @@
           <w:sz w:val="28"/>
           <w:szCs w:val="28"/>
         </w:rPr>
-        <w:t xml:space="preserve">CLÁUSULA 7ª – DA PROTEÇÃO DE DADOS (LGPD)</w:t>
-      </w:r>
-    </w:p>
-    <w:p>
-      <w:pPr>
-        <w:spacing w:after="160"/>
-      </w:pPr>
-      <w:r>
-        <w:rPr>
-          <w:rFonts w:ascii="Arial" w:cs="Arial" w:eastAsia="Arial" w:hAnsi="Arial"/>
-          <w:sz w:val="22"/>
-          <w:szCs w:val="22"/>
-        </w:rPr>
-        <w:t xml:space="preserve">7.1. As partes comprometem-se a cumprir integralmente a </w:t>
-      </w:r>
-      <w:r>
-        <w:rPr>
-          <w:rFonts w:ascii="Arial" w:cs="Arial" w:eastAsia="Arial" w:hAnsi="Arial"/>
-          <w:b/>
-          <w:bCs/>
-          <w:sz w:val="22"/>
-          <w:szCs w:val="22"/>
-        </w:rPr>
-        <w:t xml:space="preserve">Lei Geral de Proteção de Dados – LGPD (Lei nº 13.709/2018)</w:t>
-      </w:r>
-      <w:r>
-        <w:rPr>
-          <w:rFonts w:ascii="Arial" w:cs="Arial" w:eastAsia="Arial" w:hAnsi="Arial"/>
-          <w:sz w:val="22"/>
-          <w:szCs w:val="22"/>
-        </w:rPr>
-        <w:t xml:space="preserve">, utilizando os dados exclusivamente para fins relacionados à execução deste contrato.</w:t>
+        <w:t xml:space="preserve">CLÁUSULA 6ª – DA VIGÊNCIA E PRAZO MÍNIMO</w:t>
+      </w:r>
+    </w:p>
+    <w:p>
+      <w:pPr>
+        <w:spacing w:after="160"/>
+      </w:pPr>
+      <w:r>
+        <w:rPr>
+          <w:rFonts w:ascii="Arial" w:cs="Arial" w:eastAsia="Arial" w:hAnsi="Arial"/>
+          <w:sz w:val="22"/>
+          <w:szCs w:val="22"/>
+        </w:rPr>
+        <w:t xml:space="preserve">6.1. O presente contrato terá vigência inicial de </w:t>
+      </w:r>
+      <w:r>
+        <w:rPr>
+          <w:rFonts w:ascii="Arial" w:cs="Arial" w:eastAsia="Arial" w:hAnsi="Arial"/>
+          <w:b/>
+          <w:bCs/>
+          <w:sz w:val="22"/>
+          <w:szCs w:val="22"/>
+        </w:rPr>
+        <w:t xml:space="preserve">{duracao_meses} meses</w:t>
+      </w:r>
+      <w:r>
+        <w:rPr>
+          <w:rFonts w:ascii="Arial" w:cs="Arial" w:eastAsia="Arial" w:hAnsi="Arial"/>
+          <w:sz w:val="22"/>
+          <w:szCs w:val="22"/>
+        </w:rPr>
+        <w:t xml:space="preserve">, com início em </w:t>
+      </w:r>
+      <w:r>
+        <w:rPr>
+          <w:rFonts w:ascii="Arial" w:cs="Arial" w:eastAsia="Arial" w:hAnsi="Arial"/>
+          <w:b/>
+          <w:bCs/>
+          <w:sz w:val="22"/>
+          <w:szCs w:val="22"/>
+        </w:rPr>
+        <w:t xml:space="preserve">{data_inicio}</w:t>
+      </w:r>
+      <w:r>
+        <w:rPr>
+          <w:rFonts w:ascii="Arial" w:cs="Arial" w:eastAsia="Arial" w:hAnsi="Arial"/>
+          <w:sz w:val="22"/>
+          <w:szCs w:val="22"/>
+        </w:rPr>
+        <w:t xml:space="preserve"> e término em </w:t>
+      </w:r>
+      <w:r>
+        <w:rPr>
+          <w:rFonts w:ascii="Arial" w:cs="Arial" w:eastAsia="Arial" w:hAnsi="Arial"/>
+          <w:b/>
+          <w:bCs/>
+          <w:sz w:val="22"/>
+          <w:szCs w:val="22"/>
+        </w:rPr>
+        <w:t xml:space="preserve">{data_fim}</w:t>
+      </w:r>
+      <w:r>
+        <w:rPr>
+          <w:rFonts w:ascii="Arial" w:cs="Arial" w:eastAsia="Arial" w:hAnsi="Arial"/>
+          <w:sz w:val="22"/>
+          <w:szCs w:val="22"/>
+        </w:rPr>
+        <w:t xml:space="preserve">.</w:t>
       </w:r>
     </w:p>
     <w:p>
@@ -910,33 +994,38 @@
           <w:sz w:val="28"/>
           <w:szCs w:val="28"/>
         </w:rPr>
-        <w:t xml:space="preserve">CLÁUSULA 8ª – DO USO DE IMAGEM, MARCA E RESULTADOS</w:t>
-      </w:r>
-    </w:p>
-    <w:p>
-      <w:pPr>
-        <w:spacing w:after="160"/>
-      </w:pPr>
-      <w:r>
-        <w:rPr>
-          <w:rFonts w:ascii="Arial" w:cs="Arial" w:eastAsia="Arial" w:hAnsi="Arial"/>
-          <w:sz w:val="22"/>
-          <w:szCs w:val="22"/>
-        </w:rPr>
-        <w:t xml:space="preserve">8.1. A CONTRATANTE autoriza a CONTRATADA a utilizar sua marca, nome comercial e resultados obtidos durante a prestação dos serviços para fins de portfólio, divulgação institucional e marketing.</w:t>
-      </w:r>
-    </w:p>
-    <w:p>
-      <w:pPr>
-        <w:spacing w:after="160"/>
-      </w:pPr>
-      <w:r>
-        <w:rPr>
-          <w:rFonts w:ascii="Arial" w:cs="Arial" w:eastAsia="Arial" w:hAnsi="Arial"/>
-          <w:sz w:val="22"/>
-          <w:szCs w:val="22"/>
-        </w:rPr>
-        <w:t xml:space="preserve">8.2. A CONTRATANTE poderá solicitar a remoção do uso de sua marca ou imagem a qualquer momento, mediante solicitação formal.</w:t>
+        <w:t xml:space="preserve">CLÁUSULA 7ª – DA PROTEÇÃO DE DADOS (LGPD)</w:t>
+      </w:r>
+    </w:p>
+    <w:p>
+      <w:pPr>
+        <w:spacing w:after="160"/>
+      </w:pPr>
+      <w:r>
+        <w:rPr>
+          <w:rFonts w:ascii="Arial" w:cs="Arial" w:eastAsia="Arial" w:hAnsi="Arial"/>
+          <w:sz w:val="22"/>
+          <w:szCs w:val="22"/>
+        </w:rPr>
+        <w:t xml:space="preserve">7.1. As partes comprometem-se a cumprir integralmente a </w:t>
+      </w:r>
+      <w:r>
+        <w:rPr>
+          <w:rFonts w:ascii="Arial" w:cs="Arial" w:eastAsia="Arial" w:hAnsi="Arial"/>
+          <w:b/>
+          <w:bCs/>
+          <w:sz w:val="22"/>
+          <w:szCs w:val="22"/>
+        </w:rPr>
+        <w:t xml:space="preserve">Lei Geral de Proteção de Dados – LGPD (Lei nº 13.709/2018)</w:t>
+      </w:r>
+      <w:r>
+        <w:rPr>
+          <w:rFonts w:ascii="Arial" w:cs="Arial" w:eastAsia="Arial" w:hAnsi="Arial"/>
+          <w:sz w:val="22"/>
+          <w:szCs w:val="22"/>
+        </w:rPr>
+        <w:t xml:space="preserve">, utilizando os dados exclusivamente para fins relacionados à execução deste contrato.</w:t>
       </w:r>
     </w:p>
     <w:p>
@@ -952,161 +1041,33 @@
           <w:sz w:val="28"/>
           <w:szCs w:val="28"/>
         </w:rPr>
-        <w:t xml:space="preserve">CLÁUSULA 9ª – DO FORO</w:t>
-      </w:r>
-    </w:p>
-    <w:p>
-      <w:pPr>
-        <w:spacing w:after="160"/>
-      </w:pPr>
-      <w:r>
-        <w:rPr>
-          <w:rFonts w:ascii="Arial" w:cs="Arial" w:eastAsia="Arial" w:hAnsi="Arial"/>
-          <w:sz w:val="22"/>
-          <w:szCs w:val="22"/>
-        </w:rPr>
-        <w:t xml:space="preserve">9.1. Fica eleito o foro da comarca de </w:t>
-      </w:r>
-      <w:r>
-        <w:rPr>
-          <w:rFonts w:ascii="Arial" w:cs="Arial" w:eastAsia="Arial" w:hAnsi="Arial"/>
-          <w:b/>
-          <w:bCs/>
-          <w:sz w:val="22"/>
-          <w:szCs w:val="22"/>
-        </w:rPr>
-        <w:t xml:space="preserve">Belo Horizonte – MG</w:t>
-      </w:r>
-      <w:r>
-        <w:rPr>
-          <w:rFonts w:ascii="Arial" w:cs="Arial" w:eastAsia="Arial" w:hAnsi="Arial"/>
-          <w:sz w:val="22"/>
-          <w:szCs w:val="22"/>
-        </w:rPr>
-        <w:t xml:space="preserve">, com renúncia expressa a qualquer outro, por mais privilegiado que seja, para dirimir quaisquer controvérsias oriundas deste contrato.</w:t>
-      </w:r>
-    </w:p>
-    <w:p>
-      <w:pPr>
-        <w:spacing w:after="120"/>
-      </w:pPr>
-      <w:r>
-        <w:rPr>
-          <w:rFonts w:ascii="Arial" w:cs="Arial" w:eastAsia="Arial" w:hAnsi="Arial"/>
-          <w:b/>
-          <w:bCs/>
-          <w:sz w:val="22"/>
-          <w:szCs w:val="22"/>
-        </w:rPr>
-        <w:t>CLÁUSULA 10ª – DO BENEFÍCIO DE RENOVAÇÃO (CASHBACK)</w:t>
-      </w:r>
-    </w:p>
-    <w:p>
-      <w:pPr>
-        <w:spacing w:after="60"/>
-      </w:pPr>
-      <w:r>
-        <w:rPr>
-          <w:rFonts w:ascii="Arial" w:cs="Arial" w:eastAsia="Arial" w:hAnsi="Arial"/>
-          <w:sz w:val="22"/>
-          <w:szCs w:val="22"/>
-        </w:rPr>
-        <w:t xml:space="preserve">10.1. Ao CONTRATANTE do Plano Starter que permanecer com os serviços da CONTRATADA por, no mínimo, 45 (quarenta e cinco) dias corridos, será concedido um benefício de desconto equivalente ao valor total pago pelo presente contrato, aplicável exclusivamente na contratação do Plano Premium ou do Plano Elite da CONTRATADA.</w:t>
-      </w:r>
-    </w:p>
-    <w:p>
-      <w:pPr>
-        <w:spacing w:after="60"/>
-      </w:pPr>
-      <w:r>
-        <w:rPr>
-          <w:rFonts w:ascii="Arial" w:cs="Arial" w:eastAsia="Arial" w:hAnsi="Arial"/>
-          <w:sz w:val="22"/>
-          <w:szCs w:val="22"/>
-        </w:rPr>
-        <w:t xml:space="preserve">10.2. O benefício de desconto estará sujeito às seguintes condições:</w:t>
-      </w:r>
-    </w:p>
-    <w:p>
-      <w:pPr>
-        <w:spacing w:after="60"/>
-        <w:ind w:left="360"/>
-      </w:pPr>
-      <w:r>
-        <w:rPr>
-          <w:rFonts w:ascii="Arial" w:cs="Arial" w:eastAsia="Arial" w:hAnsi="Arial"/>
-          <w:sz w:val="22"/>
-          <w:szCs w:val="22"/>
-        </w:rPr>
-        <w:t xml:space="preserve">a) Somente será válido após o cumprimento integral de 45 (quarenta e cinco) dias corridos de prestação de serviços do Plano Starter;</w:t>
-      </w:r>
-    </w:p>
-    <w:p>
-      <w:pPr>
-        <w:spacing w:after="60"/>
-        <w:ind w:left="360"/>
-      </w:pPr>
-      <w:r>
-        <w:rPr>
-          <w:rFonts w:ascii="Arial" w:cs="Arial" w:eastAsia="Arial" w:hAnsi="Arial"/>
-          <w:sz w:val="22"/>
-          <w:szCs w:val="22"/>
-        </w:rPr>
-        <w:t xml:space="preserve">b) Deverá ser utilizado pelo próprio CONTRATANTE, sendo intransferível e não convertível em espécie;</w:t>
-      </w:r>
-    </w:p>
-    <w:p>
-      <w:pPr>
-        <w:spacing w:after="60"/>
-        <w:ind w:left="360"/>
-      </w:pPr>
-      <w:r>
-        <w:rPr>
-          <w:rFonts w:ascii="Arial" w:cs="Arial" w:eastAsia="Arial" w:hAnsi="Arial"/>
-          <w:sz w:val="22"/>
-          <w:szCs w:val="22"/>
-        </w:rPr>
-        <w:t xml:space="preserve">c) Aplica-se exclusivamente à contratação dos planos Premium ou Elite, sem cumulatividade com outros descontos ou benefícios;</w:t>
-      </w:r>
-    </w:p>
-    <w:p>
-      <w:pPr>
-        <w:spacing w:after="60"/>
-        <w:ind w:left="360"/>
-      </w:pPr>
-      <w:r>
-        <w:rPr>
-          <w:rFonts w:ascii="Arial" w:cs="Arial" w:eastAsia="Arial" w:hAnsi="Arial"/>
-          <w:sz w:val="22"/>
-          <w:szCs w:val="22"/>
-        </w:rPr>
-        <w:t xml:space="preserve">d) O CONTRATANTE deverá manifestar interesse na renovação durante a vigência deste contrato ou em até 30 (trinta) dias após o seu encerramento.</w:t>
-      </w:r>
-    </w:p>
-    <w:p>
-      <w:pPr>
-        <w:spacing w:after="60"/>
-      </w:pPr>
-      <w:r>
-        <w:rPr>
-          <w:rFonts w:ascii="Arial" w:cs="Arial" w:eastAsia="Arial" w:hAnsi="Arial"/>
-          <w:sz w:val="22"/>
-          <w:szCs w:val="22"/>
-        </w:rPr>
-        <w:t xml:space="preserve">10.3. O benefício previsto nesta cláusula constitui um incentivo comercial da CONTRATADA e não gera qualquer obrigação de renovação por parte do CONTRATANTE.</w:t>
-      </w:r>
-    </w:p>
-    <w:p>
-      <w:pPr>
-        <w:spacing w:after="60"/>
-      </w:pPr>
-      <w:r>
-        <w:rPr>
-          <w:rFonts w:ascii="Arial" w:cs="Arial" w:eastAsia="Arial" w:hAnsi="Arial"/>
-          <w:sz w:val="22"/>
-          <w:szCs w:val="22"/>
-        </w:rPr>
-        <w:t xml:space="preserve"/>
+        <w:t xml:space="preserve">CLÁUSULA 8ª – DO USO DE IMAGEM, MARCA E RESULTADOS</w:t>
+      </w:r>
+    </w:p>
+    <w:p>
+      <w:pPr>
+        <w:spacing w:after="160"/>
+      </w:pPr>
+      <w:r>
+        <w:rPr>
+          <w:rFonts w:ascii="Arial" w:cs="Arial" w:eastAsia="Arial" w:hAnsi="Arial"/>
+          <w:sz w:val="22"/>
+          <w:szCs w:val="22"/>
+        </w:rPr>
+        <w:t xml:space="preserve">8.1. A CONTRATANTE autoriza a CONTRATADA a utilizar sua marca, nome comercial e resultados obtidos durante a prestação dos serviços para fins de portfólio, divulgação institucional e marketing.</w:t>
+      </w:r>
+    </w:p>
+    <w:p>
+      <w:pPr>
+        <w:spacing w:after="160"/>
+      </w:pPr>
+      <w:r>
+        <w:rPr>
+          <w:rFonts w:ascii="Arial" w:cs="Arial" w:eastAsia="Arial" w:hAnsi="Arial"/>
+          <w:sz w:val="22"/>
+          <w:szCs w:val="22"/>
+        </w:rPr>
+        <w:t xml:space="preserve">8.2. A CONTRATANTE poderá solicitar a remoção do uso de sua marca ou imagem a qualquer momento, mediante solicitação formal.</w:t>
       </w:r>
     </w:p>
     <w:p>
@@ -1122,7 +1083,54 @@
           <w:sz w:val="28"/>
           <w:szCs w:val="28"/>
         </w:rPr>
-        <w:t xml:space="preserve">CLÁUSULA 11ª – DAS ASSINATURAS</w:t>
+        <w:t xml:space="preserve">CLÁUSULA 9ª – DO FORO</w:t>
+      </w:r>
+    </w:p>
+    <w:p>
+      <w:pPr>
+        <w:spacing w:after="160"/>
+      </w:pPr>
+      <w:r>
+        <w:rPr>
+          <w:rFonts w:ascii="Arial" w:cs="Arial" w:eastAsia="Arial" w:hAnsi="Arial"/>
+          <w:sz w:val="22"/>
+          <w:szCs w:val="22"/>
+        </w:rPr>
+        <w:t xml:space="preserve">9.1. Fica eleito o foro da comarca de </w:t>
+      </w:r>
+      <w:r>
+        <w:rPr>
+          <w:rFonts w:ascii="Arial" w:cs="Arial" w:eastAsia="Arial" w:hAnsi="Arial"/>
+          <w:b/>
+          <w:bCs/>
+          <w:sz w:val="22"/>
+          <w:szCs w:val="22"/>
+        </w:rPr>
+        <w:t xml:space="preserve">Belo Horizonte – MG</w:t>
+      </w:r>
+      <w:r>
+        <w:rPr>
+          <w:rFonts w:ascii="Arial" w:cs="Arial" w:eastAsia="Arial" w:hAnsi="Arial"/>
+          <w:sz w:val="22"/>
+          <w:szCs w:val="22"/>
+        </w:rPr>
+        <w:t xml:space="preserve">, com renúncia expressa a qualquer outro, por mais privilegiado que seja, para dirimir quaisquer controvérsias oriundas deste contrato.</w:t>
+      </w:r>
+    </w:p>
+    <w:p>
+      <w:pPr>
+        <w:pStyle w:val="Heading1"/>
+        <w:spacing w:after="160" w:before="240"/>
+      </w:pPr>
+      <w:r>
+        <w:rPr>
+          <w:rFonts w:ascii="Arial" w:cs="Arial" w:eastAsia="Arial" w:hAnsi="Arial"/>
+          <w:b/>
+          <w:bCs/>
+          <w:sz w:val="28"/>
+          <w:szCs w:val="28"/>
+        </w:rPr>
+        <w:t xml:space="preserve">CLÁUSULA 10ª – DAS ASSINATURAS</w:t>
       </w:r>
     </w:p>
     <w:p>

</xml_diff>